<commit_message>
feat: Add agency ready checklist and legal notice, and update agency package.
</commit_message>
<xml_diff>
--- a/AgencyReady/Moodboard_Visual_Language.docx
+++ b/AgencyReady/Moodboard_Visual_Language.docx
@@ -4,6 +4,16 @@
   <w:background w:color="FFFFFF"/>
   <w:body>
     <w:p>
+      <w:r>
+        <w:rPr>
+          <w:sz w:val="18"/>
+        </w:rPr>
+        <w:t>???????????????????? ?????????????????????????? ??????????????????????????????????????????????????????????</w:t>
+        <w:br/>
+        <w:t>Confidential. For evaluation only. No reproduction or distribution without prior written consent.</w:t>
+      </w:r>
+    </w:p>
+    <w:p>
       <w:pPr>
         <w:rPr/>
       </w:pPr>
@@ -1524,12 +1534,29 @@
       </w:r>
     </w:p>
     <w:sectPr>
+      <w:headerReference w:type="default" r:id="rId6"/>
       <w:pgSz w:h="16838" w:w="11906" w:orient="portrait"/>
       <w:pgMar w:bottom="1440" w:top="1440" w:left="835.1999999999999" w:right="835.1999999999999" w:header="720" w:footer="720"/>
       <w:pgNumType w:start="1"/>
     </w:sectPr>
   </w:body>
 </w:document>
+</file>
+
+<file path=word/header1.xml><?xml version="1.0" encoding="utf-8"?>
+<w:hdr xmlns:m="http://schemas.openxmlformats.org/officeDocument/2006/math" xmlns:mc="http://schemas.openxmlformats.org/markup-compatibility/2006" xmlns:mo="http://schemas.microsoft.com/office/mac/office/2008/main" xmlns:mv="urn:schemas-microsoft-com:mac:vml" xmlns:o="urn:schemas-microsoft-com:office:office" xmlns:r="http://schemas.openxmlformats.org/officeDocument/2006/relationships" xmlns:v="urn:schemas-microsoft-com:vml" xmlns:w10="urn:schemas-microsoft-com:office:word" xmlns:w14="http://schemas.microsoft.com/office/word/2010/wordml" xmlns:w="http://schemas.openxmlformats.org/wordprocessingml/2006/main" xmlns:wne="http://schemas.microsoft.com/office/word/2006/wordml" xmlns:wp14="http://schemas.microsoft.com/office/word/2010/wordprocessingDrawing" xmlns:wp="http://schemas.openxmlformats.org/drawingml/2006/wordprocessingDrawing" xmlns:wpc="http://schemas.microsoft.com/office/word/2010/wordprocessingCanvas" xmlns:wpg="http://schemas.microsoft.com/office/word/2010/wordprocessingGroup" xmlns:wpi="http://schemas.microsoft.com/office/word/2010/wordprocessingInk" xmlns:wps="http://schemas.microsoft.com/office/word/2010/wordprocessingShape" mc:Ignorable="w14 wp14">
+  <w:p>
+    <w:pPr>
+      <w:pStyle w:val="Header"/>
+    </w:pPr>
+    <w:r>
+      <w:rPr>
+        <w:sz w:val="16"/>
+      </w:rPr>
+      <w:t>CONFIDENTIAL - Kanin Raksaraj - Reality Fusion</w:t>
+    </w:r>
+  </w:p>
+</w:hdr>
 </file>
 
 <file path=word/numbering.xml><?xml version="1.0" encoding="utf-8"?>

</xml_diff>